<commit_message>
v3.0.0 DOI backfill: 10.5281/zenodo.20763197
Reserved DOI from Zenodo draft deposit 20763197 backfilled into:
- Manuscript v0.10k Abstract + section 7 Data and Code Availability
- README.md (new structured version with all DOI mappings)
- NEWS_v3.0.0.md
- docx and PPTX regenerated

Pending: user clicks publish in Zenodo web UI to mint the DOI. The reserved
DOI 10.5281/zenodo.20763197 will become the official v3.0.0 DOI at that
moment. The 13 GB unmasked file upload (job 11787174) is still in flight as
the 5th deposit file.
</commit_message>
<xml_diff>
--- a/manuscript/CSPI_v0_10k_FEM_combined.docx
+++ b/manuscript/CSPI_v0_10k_FEM_combined.docx
@@ -23,7 +23,7 @@
         <w:pStyle w:val="Date"/>
       </w:pPr>
       <w:r>
-        <w:t xml:space="preserve">17 June 2026</w:t>
+        <w:t xml:space="preserve">19 June 2026</w:t>
       </w:r>
     </w:p>
     <w:sdt>
@@ -98,7 +98,7 @@
         <w:t xml:space="preserve"> </w:t>
       </w:r>
       <w:r>
-        <w:t xml:space="preserve">documents the structural drivers of metric divergence: where the measures disagree, why they disagree, and what that means biologically. Species heterogeneity, East-vs-West regime, multilevel ecoregion, geologic parent material, forest type group, disturbance and treatment context, and a new disturbance × ecoregion interaction analysis (joint r(ESI,BGI) range = 1.40 across 115 cells, wider than any single stratification) all enter as evidence that productivity-dimension orthogonality is structurally organized by what kind of forest is on the plot and what has happened to it. Adding parent material as a categorical predictor matters most for asymptotic biomass (ΔR² = +0.008 in the v3.0.0 30 m surface) and not at all for height-growth-potential ESI (ΔR² = +0.001). The v3.0.0 surface release ships ASYM_V9_CONUS_30m.tif alongside the v7 ESI baseline and parent material 30 m overlay. Data concept DOI 10.5281/zenodo.20515034. Analytical chain DOI 10.5281/zenodo.20693106. v2.0.0 DOI 10.5281/zenodo.20663652.</w:t>
+        <w:t xml:space="preserve">documents the structural drivers of metric divergence: where the measures disagree, why they disagree, and what that means biologically. Species heterogeneity, East-vs-West regime, multilevel ecoregion, geologic parent material, forest type group, disturbance and treatment context, and a new disturbance × ecoregion interaction analysis (joint r(ESI,BGI) range = 1.40 across 115 cells, wider than any single stratification) all enter as evidence that productivity-dimension orthogonality is structurally organized by what kind of forest is on the plot and what has happened to it. Adding parent material as a categorical predictor matters most for asymptotic biomass (ΔR² = +0.008 in the v3.0.0 30 m surface) and not at all for height-growth-potential ESI (ΔR² = +0.001). The v3.0.0 surface release ships ASYM_V9_CONUS_30m.tif alongside the v7 ESI baseline and parent material 30 m overlay. Data concept DOI 10.5281/zenodo.20515034. Analytical chain DOI 10.5281/zenodo.20693106. v2.0.0 DOI 10.5281/zenodo.20663652. v3.0.0 DOI 10.5281/zenodo.20763197 (this paper).</w:t>
       </w:r>
     </w:p>
     <w:p>
@@ -12372,7 +12372,49 @@
         <w:pStyle w:val="FirstParagraph"/>
       </w:pPr>
       <w:r>
-        <w:t xml:space="preserve">CSPI v2.0.0 is at 10.5281/zenodo.20663652 (concept 10.5281/zenodo.20515034), CC-BY-4.0. The release contains the recommended 1 km ESI v6 surface, MOD17A3HGF NPP at 500 m, and documentation; the full 30 m surfaces follow in v2.1.0. The SICOND-target v3 and v4 surfaces from v1.0.0 (10.5281/zenodo.20515035) remain available. Pipeline at https://github.com/holoros/cspi-conus. Analytical chain archive at https://doi.org/10.5281/zenodo.20693106.</w:t>
+        <w:t xml:space="preserve">CSPI v3.0.0, the data release accompanying this manuscript, is at https://doi.org/10.5281/zenodo.20763197 (concept 10.5281/zenodo.20515034), CC-BY-4.0. The release contains the Asym v9 corrective surface at 30 m (forest-masked,</w:t>
+      </w:r>
+      <w:r>
+        <w:t xml:space="preserve"> </w:t>
+      </w:r>
+      <w:r>
+        <w:rPr>
+          <w:rStyle w:val="VerbatimChar"/>
+        </w:rPr>
+        <w:t xml:space="preserve">ASYM_V9_CONUS_30m_fm.tif</w:t>
+      </w:r>
+      <w:r>
+        <w:t xml:space="preserve">, headline product for existing-forest assessment; unmasked,</w:t>
+      </w:r>
+      <w:r>
+        <w:t xml:space="preserve"> </w:t>
+      </w:r>
+      <w:r>
+        <w:rPr>
+          <w:rStyle w:val="VerbatimChar"/>
+        </w:rPr>
+        <w:t xml:space="preserve">ASYM_V9_CONUS_30m.tif</w:t>
+      </w:r>
+      <w:r>
+        <w:t xml:space="preserve">, for reforestation use cases where non-forest pixels carry model-estimated potential mature carrying capacity), the parent material 30 m CONUS overlay (</w:t>
+      </w:r>
+      <w:r>
+        <w:rPr>
+          <w:rStyle w:val="VerbatimChar"/>
+        </w:rPr>
+        <w:t xml:space="preserve">parent_material_30m_CONUS_4326.tif</w:t>
+      </w:r>
+      <w:r>
+        <w:t xml:space="preserve">), the trained ranger model object (</w:t>
+      </w:r>
+      <w:r>
+        <w:rPr>
+          <w:rStyle w:val="VerbatimChar"/>
+        </w:rPr>
+        <w:t xml:space="preserve">m_asym_v9_v3stack.rds</w:t>
+      </w:r>
+      <w:r>
+        <w:t xml:space="preserve">) for reproducibility, and release notes. v2.0.0 (10.5281/zenodo.20663652) remains available and contains the 1 km ESI v6 surface and MOD17A3HGF NPP at 500 m; the SICOND-target v3 and v4 surfaces from v1.0.0 (10.5281/zenodo.20515035) also remain available. Pipeline at https://github.com/holoros/cspi-conus. Analytical chain archive at https://doi.org/10.5281/zenodo.20693106.</w:t>
       </w:r>
     </w:p>
     <w:bookmarkEnd w:id="54"/>

</xml_diff>